<commit_message>
Build LitRes DOCX for Ne ver golosu
</commit_message>
<xml_diff>
--- a/ne-ver-golosu/dist/ne-ver-golosu-litres.docx
+++ b/ne-ver-golosu/dist/ne-ver-golosu-litres.docx
@@ -13988,6 +13988,7 @@
     </w:pPr>
     <w:rPr>
       <w:rFonts w:ascii="Times New Roman" w:hAnsi="Times New Roman" w:eastAsia="Times New Roman"/>
+      <w:color w:val="000000"/>
       <w:sz w:val="24"/>
     </w:rPr>
   </w:style>
@@ -14053,7 +14054,7 @@
       <w:rFonts w:asciiTheme="majorHAnsi" w:eastAsiaTheme="majorEastAsia" w:hAnsiTheme="majorHAnsi" w:cstheme="majorBidi" w:ascii="Times New Roman" w:hAnsi="Times New Roman" w:eastAsia="Times New Roman"/>
       <w:b/>
       <w:bCs/>
-      <w:color w:val="365F91" w:themeColor="accent1" w:themeShade="BF"/>
+      <w:color w:val="000000"/>
       <w:sz w:val="36"/>
       <w:szCs w:val="28"/>
     </w:rPr>
@@ -14077,7 +14078,7 @@
       <w:rFonts w:asciiTheme="majorHAnsi" w:eastAsiaTheme="majorEastAsia" w:hAnsiTheme="majorHAnsi" w:cstheme="majorBidi" w:ascii="Times New Roman" w:hAnsi="Times New Roman" w:eastAsia="Times New Roman"/>
       <w:b/>
       <w:bCs/>
-      <w:color w:val="4F81BD" w:themeColor="accent1"/>
+      <w:color w:val="000000"/>
       <w:sz w:val="30"/>
       <w:szCs w:val="26"/>
     </w:rPr>
@@ -14101,7 +14102,7 @@
       <w:rFonts w:asciiTheme="majorHAnsi" w:eastAsiaTheme="majorEastAsia" w:hAnsiTheme="majorHAnsi" w:cstheme="majorBidi" w:ascii="Times New Roman" w:hAnsi="Times New Roman" w:eastAsia="Times New Roman"/>
       <w:b/>
       <w:bCs/>
-      <w:color w:val="4F81BD" w:themeColor="accent1"/>
+      <w:color w:val="000000"/>
       <w:sz w:val="26"/>
     </w:rPr>
   </w:style>
@@ -14127,7 +14128,7 @@
       <w:bCs/>
       <w:i/>
       <w:iCs/>
-      <w:color w:val="4F81BD" w:themeColor="accent1"/>
+      <w:color w:val="000000"/>
       <w:sz w:val="24"/>
     </w:rPr>
   </w:style>

</xml_diff>